<commit_message>
research: design the template and make the report extensive
Design the branded reference so the Word file no longer looks default:
a teal bold title, a teal rule under every top-level heading, one-inch
margins, a shaded left-barred code style, and the cross-platform code
font. Expand the report from a short note to a full treatment: a system
model of the capability-based ZeroState kernel the theorems protect,
formal statements for the memory, synchronization, reclamation, IPC,
scheduling, cryptographic, zeroization, filesystem, parser and IOMMU
layers, an evaluation covering the defects the proofs found and the
continuous enforcement, and a discussion of the extraction frontier.
Thirty-nine formal statements over the real verified surface.
</commit_message>
<xml_diff>
--- a/verification/research/branded-reference.docx
+++ b/verification/research/branded-reference.docx
@@ -314,6 +314,8 @@
       </w:r>
     </w:p>
     <w:sectPr>
+      <w:pgSz w:w="12240" w:h="15840"/>
+      <w:pgMar w:top="1440" w:right="1440" w:bottom="1440" w:left="1440" w:header="720" w:footer="720" w:gutter="0"/>
       <w:footnotePr>
         <w:numRestart w:val="eachSect"/>
       </w:footnotePr>
@@ -552,6 +554,8 @@
     <w:rsid w:val="00A10FD9"/>
     <w:rPr>
       <w:rFonts w:asciiTheme="majorHAnsi" w:eastAsiaTheme="majorEastAsia" w:hAnsiTheme="majorHAnsi" w:cstheme="majorBidi"/>
+      <w:color w:val="2E5C5C"/>
+      <w:b/>
       <w:sz w:val="56"/>
       <w:szCs w:val="56"/>
     </w:rPr>
@@ -584,7 +588,7 @@
     <w:rsid w:val="00A10FD9"/>
     <w:rPr>
       <w:rFonts w:eastAsiaTheme="majorEastAsia" w:cstheme="majorBidi"/>
-      <w:color w:val="595959" w:themeColor="text1" w:themeTint="A6"/>
+      <w:color w:val="2E5C5C"/>
       <w:spacing w:val="15"/>
       <w:sz w:val="28"/>
       <w:szCs w:val="28"/>
@@ -669,7 +673,13 @@
     <w:pPr>
       <w:keepNext/>
       <w:keepLines/>
+      <w:pBdr>
+        <w:bottom w:val="single" w:sz="6" w:space="6" w:color="2E5C5C"/>
+      </w:pBdr>
       <w:spacing w:before="360" w:after="80"/>
+      <w:pBdr>
+        <w:bottom w:val="single" w:sz="6" w:space="4" w:color="66FFFF"/>
+      </w:pBdr>
       <w:outlineLvl w:val="0"/>
     </w:pPr>
     <w:rPr>
@@ -789,7 +799,7 @@
       <w:rFonts w:eastAsiaTheme="majorEastAsia" w:cstheme="majorBidi"/>
       <w:i/>
       <w:iCs/>
-      <w:color w:val="595959" w:themeColor="text1" w:themeTint="A6"/>
+      <w:color w:val="2E5C5C" w:themeColor="text1" w:themeTint="A6"/>
     </w:rPr>
   </w:style>
   <w:style w:type="paragraph" w:styleId="Heading7">
@@ -810,7 +820,7 @@
     </w:pPr>
     <w:rPr>
       <w:rFonts w:eastAsiaTheme="majorEastAsia" w:cstheme="majorBidi"/>
-      <w:color w:val="595959" w:themeColor="text1" w:themeTint="A6"/>
+      <w:color w:val="2E5C5C" w:themeColor="text1" w:themeTint="A6"/>
     </w:rPr>
   </w:style>
   <w:style w:type="paragraph" w:styleId="Heading8">
@@ -935,7 +945,7 @@
       <w:rFonts w:eastAsiaTheme="majorEastAsia" w:cstheme="majorBidi"/>
       <w:i/>
       <w:iCs/>
-      <w:color w:val="595959" w:themeColor="text1" w:themeTint="A6"/>
+      <w:color w:val="2E5C5C" w:themeColor="text1" w:themeTint="A6"/>
     </w:rPr>
   </w:style>
   <w:style w:type="character" w:customStyle="1" w:styleId="Heading7Char">
@@ -947,7 +957,7 @@
     <w:rsid w:val="00A10FD9"/>
     <w:rPr>
       <w:rFonts w:eastAsiaTheme="majorEastAsia" w:cstheme="majorBidi"/>
-      <w:color w:val="595959" w:themeColor="text1" w:themeTint="A6"/>
+      <w:color w:val="2E5C5C" w:themeColor="text1" w:themeTint="A6"/>
     </w:rPr>
   </w:style>
   <w:style w:type="character" w:customStyle="1" w:styleId="Heading8Char">
@@ -1134,6 +1144,24 @@
       <w:b w:val="0"/>
       <w:bCs w:val="0"/>
       <w:color w:val="365F91" w:themeColor="accent1"/>
+    </w:rPr>
+  </w:style>
+  <w:style w:type="paragraph" w:styleId="SourceCode">
+    <w:name w:val="Source Code"/>
+    <w:basedOn w:val="Normal"/>
+    <w:qFormat/>
+    <w:pPr>
+      <w:keepLines/>
+      <w:shd w:val="clear" w:color="auto" w:fill="F3F7F7"/>
+      <w:pBdr>
+        <w:left w:val="single" w:sz="18" w:space="8" w:color="2E5C5C"/>
+      </w:pBdr>
+      <w:spacing w:before="40" w:after="40" w:line="240" w:lineRule="auto"/>
+      <w:ind w:left="240" w:right="120"/>
+    </w:pPr>
+    <w:rPr>
+      <w:rFonts w:ascii="Courier New" w:hAnsi="Courier New" w:cs="Courier New"/>
+      <w:sz w:val="18"/>
     </w:rPr>
   </w:style>
 </w:styles>

</xml_diff>

<commit_message>
research: fix cover page and toc paging, extend with full module inventory
The cover break landed before the title, leaving page one blank; place
the breaks correctly so the title block stands on page one, the table of
contents takes page two alone, and the body begins on page three. The
table of contents now carries dot leaders and right-aligned page numbers,
and a branded footer with the wordmark and a page number runs on every
page. Extend the report with a complete inventory of all 120
specification modules grouped by subsystem, so coverage can be audited in
full, and a notation appendix.
</commit_message>
<xml_diff>
--- a/verification/research/branded-reference.docx
+++ b/verification/research/branded-reference.docx
@@ -1163,6 +1163,48 @@
       <w:rFonts w:ascii="Courier New" w:hAnsi="Courier New" w:cs="Courier New"/>
       <w:sz w:val="18"/>
     </w:rPr>
+  </w:style>
+  <w:style w:type="paragraph" w:styleId="TOC1">
+    <w:name w:val="toc 1"/>
+    <w:basedOn w:val="Normal"/>
+    <w:next w:val="Normal"/>
+    <w:uiPriority w:val="39"/>
+    <w:pPr>
+      <w:tabs>
+        <w:tab w:val="right" w:leader="dot" w:pos="9350"/>
+      </w:tabs>
+      <w:spacing w:before="120" w:after="0" w:line="240" w:lineRule="auto"/>
+    </w:pPr>
+    <w:rPr>
+      <w:b/>
+      <w:color w:val="2E5C5C"/>
+    </w:rPr>
+  </w:style>
+  <w:style w:type="paragraph" w:styleId="TOC2">
+    <w:name w:val="toc 2"/>
+    <w:basedOn w:val="Normal"/>
+    <w:next w:val="Normal"/>
+    <w:uiPriority w:val="39"/>
+    <w:pPr>
+      <w:tabs>
+        <w:tab w:val="right" w:leader="dot" w:pos="9350"/>
+      </w:tabs>
+      <w:spacing w:before="0" w:after="0" w:line="240" w:lineRule="auto"/>
+      <w:ind w:left="340"/>
+    </w:pPr>
+  </w:style>
+  <w:style w:type="paragraph" w:styleId="TOC3">
+    <w:name w:val="toc 3"/>
+    <w:basedOn w:val="Normal"/>
+    <w:next w:val="Normal"/>
+    <w:uiPriority w:val="39"/>
+    <w:pPr>
+      <w:tabs>
+        <w:tab w:val="right" w:leader="dot" w:pos="9350"/>
+      </w:tabs>
+      <w:spacing w:before="0" w:after="0" w:line="240" w:lineRule="auto"/>
+      <w:ind w:left="680"/>
+    </w:pPr>
   </w:style>
 </w:styles>
 </file>

</xml_diff>